<commit_message>
feat: refine graph annotations and FRF workspace
Исправлены подписи и числовые шкалы всех графиков, отображение АЧХ после расчёта, рамки её графиков, русские и английские тексты панели, а также мерцание панели при навигации.\n\nДоработаны независимые пользовательские подписи X/Y режимов, физические вертикальные подписи шкал, линейная частотная шкала АЧХ по умолчанию, отдельные точки средней опоры с сохранением в проекте и регулируемый разделитель двух графиков с визуальным захватом.\n\nДобавлено перетаскивание точек, маркеров и вертикальных/горизонтальных линий в Time, Spectrum и АЧХ с сохранением Snap и одним действием Undo/Redo. Добавлена кнопка блокировки разметки, запрещающая добавление, перенос и очистку объектов без блокировки навигации.\n\nОбновлены AGENTS.md, карта архитектуры, CHANGELOG и русское пользовательское руководство в Markdown и Word. Регрессионный GUI-тест расширен до 321 проверки.
</commit_message>
<xml_diff>
--- a/docs/manual/AMSignal_User_Manual_RU.docx
+++ b/docs/manual/AMSignal_User_Manual_RU.docx
@@ -2459,12 +2459,40 @@
         </w:rPr>
       </w:pPr>
       <w:r>
-        <w:rPr>
-          <w:rFonts w:ascii="Times New Roman" w:hAnsi="Times New Roman" w:cs="Times New Roman"/>
-          <w:color w:val="000000"/>
-          <w:lang w:val="ru-RU"/>
-        </w:rPr>
-        <w:t xml:space="preserve">**Верхняя панель.** Здесь расположены открытие файла, селектор документа, переключение режимов </w:t>
+        <w:t>**Верхняя панель.** Здесь расположены открытие файла, селектор документа, переключение режимов Time, FFT и FRF, а также инструменты курсора, точек, маркеров, линий и кнопка блокировки разметки.</w:t>
+      </w:r>
+    </w:p>
+    <w:p>
+      <w:pPr>
+        <w:pStyle w:val="a"/>
+        <w:rPr>
+          <w:rFonts w:ascii="Times New Roman" w:hAnsi="Times New Roman" w:cs="Times New Roman"/>
+          <w:lang w:val="ru-RU"/>
+        </w:rPr>
+      </w:pPr>
+      <w:r>
+        <w:rPr>
+          <w:rFonts w:ascii="Times New Roman" w:hAnsi="Times New Roman" w:cs="Times New Roman"/>
+          <w:color w:val="000000"/>
+          <w:lang w:val="ru-RU"/>
+        </w:rPr>
+        <w:t>**Область графика.** В ней отображаются кривые, сетка, оси, легенда, разрывы и измерительные объекты.</w:t>
+      </w:r>
+    </w:p>
+    <w:p>
+      <w:pPr>
+        <w:pStyle w:val="a"/>
+        <w:rPr>
+          <w:rFonts w:ascii="Times New Roman" w:hAnsi="Times New Roman" w:cs="Times New Roman"/>
+        </w:rPr>
+      </w:pPr>
+      <w:r>
+        <w:rPr>
+          <w:rFonts w:ascii="Times New Roman" w:hAnsi="Times New Roman" w:cs="Times New Roman"/>
+          <w:color w:val="000000"/>
+          <w:lang w:val="ru-RU"/>
+        </w:rPr>
+        <w:t xml:space="preserve">**Правая панель.** В режимах </w:t>
       </w:r>
       <w:r>
         <w:rPr>
@@ -2479,14 +2507,276 @@
           <w:color w:val="000000"/>
           <w:lang w:val="ru-RU"/>
         </w:rPr>
+        <w:t xml:space="preserve"> и </w:t>
+      </w:r>
+      <w:r>
+        <w:rPr>
+          <w:rFonts w:ascii="Times New Roman" w:hAnsi="Times New Roman" w:cs="Times New Roman"/>
+          <w:color w:val="000000"/>
+        </w:rPr>
+        <w:t>FFT</w:t>
+      </w:r>
+      <w:r>
+        <w:rPr>
+          <w:rFonts w:ascii="Times New Roman" w:hAnsi="Times New Roman" w:cs="Times New Roman"/>
+          <w:color w:val="000000"/>
+          <w:lang w:val="ru-RU"/>
+        </w:rPr>
+        <w:t xml:space="preserve"> она даёт доступ к каналам, точкам и обработке. </w:t>
+      </w:r>
+      <w:r>
+        <w:rPr>
+          <w:rFonts w:ascii="Times New Roman" w:hAnsi="Times New Roman" w:cs="Times New Roman"/>
+          <w:color w:val="000000"/>
+        </w:rPr>
+        <w:t xml:space="preserve">В FRF здесь выбираются роли каналов и </w:t>
+      </w:r>
+      <w:r>
+        <w:rPr>
+          <w:rFonts w:ascii="Times New Roman" w:hAnsi="Times New Roman" w:cs="Times New Roman"/>
+          <w:color w:val="000000"/>
+        </w:rPr>
+        <w:t>параметры расчёта.</w:t>
+      </w:r>
+    </w:p>
+    <w:p>
+      <w:pPr>
+        <w:pStyle w:val="a"/>
+        <w:rPr>
+          <w:rFonts w:ascii="Times New Roman" w:hAnsi="Times New Roman" w:cs="Times New Roman"/>
+          <w:lang w:val="ru-RU"/>
+        </w:rPr>
+      </w:pPr>
+      <w:r>
+        <w:rPr>
+          <w:rFonts w:ascii="Times New Roman" w:hAnsi="Times New Roman" w:cs="Times New Roman"/>
+          <w:color w:val="000000"/>
+          <w:lang w:val="ru-RU"/>
+        </w:rPr>
+        <w:t>**Строка состояния.** Показывает текущий режим, существенные параметры и предупреждения. Наведите указатель на строку состояния, чтобы увидеть полный текст, если окно узкое.</w:t>
+      </w:r>
+    </w:p>
+    <w:p>
+      <w:pPr>
+        <w:pStyle w:val="21"/>
+        <w:rPr>
+          <w:rFonts w:ascii="Times New Roman" w:hAnsi="Times New Roman" w:cs="Times New Roman"/>
+          <w:lang w:val="ru-RU"/>
+        </w:rPr>
+      </w:pPr>
+      <w:r>
+        <w:rPr>
+          <w:rFonts w:ascii="Times New Roman" w:hAnsi="Times New Roman" w:cs="Times New Roman"/>
+          <w:lang w:val="ru-RU"/>
+        </w:rPr>
+        <w:t>4.2 Переключение режимов</w:t>
+      </w:r>
+    </w:p>
+    <w:p>
+      <w:pPr>
+        <w:rPr>
+          <w:rFonts w:ascii="Times New Roman" w:hAnsi="Times New Roman" w:cs="Times New Roman"/>
+          <w:lang w:val="ru-RU"/>
+        </w:rPr>
+      </w:pPr>
+      <w:r>
+        <w:rPr>
+          <w:rFonts w:ascii="Times New Roman" w:hAnsi="Times New Roman" w:cs="Times New Roman"/>
+          <w:b/>
+          <w:color w:val="000000"/>
+          <w:lang w:val="ru-RU"/>
+        </w:rPr>
+        <w:t>Время</w:t>
+      </w:r>
+      <w:r>
+        <w:rPr>
+          <w:rFonts w:ascii="Times New Roman" w:hAnsi="Times New Roman" w:cs="Times New Roman"/>
+          <w:color w:val="000000"/>
+          <w:lang w:val="ru-RU"/>
+        </w:rPr>
+        <w:t xml:space="preserve"> показывает исходные или обработа</w:t>
+      </w:r>
+      <w:r>
+        <w:rPr>
+          <w:rFonts w:ascii="Times New Roman" w:hAnsi="Times New Roman" w:cs="Times New Roman"/>
+          <w:color w:val="000000"/>
+          <w:lang w:val="ru-RU"/>
+        </w:rPr>
+        <w:t>нные сигналы как зависимость амплитуды от времени. Этот режим предназначен для проверки записи и выбора участка.</w:t>
+      </w:r>
+    </w:p>
+    <w:p>
+      <w:pPr>
+        <w:rPr>
+          <w:rFonts w:ascii="Times New Roman" w:hAnsi="Times New Roman" w:cs="Times New Roman"/>
+          <w:lang w:val="ru-RU"/>
+        </w:rPr>
+      </w:pPr>
+      <w:r>
+        <w:rPr>
+          <w:rFonts w:ascii="Times New Roman" w:hAnsi="Times New Roman" w:cs="Times New Roman"/>
+          <w:b/>
+          <w:color w:val="000000"/>
+          <w:lang w:val="ru-RU"/>
+        </w:rPr>
+        <w:t xml:space="preserve">Гц </w:t>
+      </w:r>
+      <w:r>
+        <w:rPr>
+          <w:rFonts w:ascii="Times New Roman" w:hAnsi="Times New Roman" w:cs="Times New Roman"/>
+          <w:b/>
+          <w:color w:val="000000"/>
+        </w:rPr>
+        <w:t>FFT</w:t>
+      </w:r>
+      <w:r>
+        <w:rPr>
+          <w:rFonts w:ascii="Times New Roman" w:hAnsi="Times New Roman" w:cs="Times New Roman"/>
+          <w:color w:val="000000"/>
+          <w:lang w:val="ru-RU"/>
+        </w:rPr>
+        <w:t xml:space="preserve"> показывает односторонний амплитудный спектр выбранных каналов. При новом участке, новой обработке или новом видимом канале спектр должен</w:t>
+      </w:r>
+      <w:r>
+        <w:rPr>
+          <w:rFonts w:ascii="Times New Roman" w:hAnsi="Times New Roman" w:cs="Times New Roman"/>
+          <w:color w:val="000000"/>
+          <w:lang w:val="ru-RU"/>
+        </w:rPr>
+        <w:t xml:space="preserve"> быть подготовлен заново.</w:t>
+      </w:r>
+    </w:p>
+    <w:p>
+      <w:pPr>
+        <w:rPr>
+          <w:rFonts w:ascii="Times New Roman" w:hAnsi="Times New Roman" w:cs="Times New Roman"/>
+          <w:lang w:val="ru-RU"/>
+        </w:rPr>
+      </w:pPr>
+      <w:r>
+        <w:rPr>
+          <w:rFonts w:ascii="Times New Roman" w:hAnsi="Times New Roman" w:cs="Times New Roman"/>
+          <w:b/>
+          <w:color w:val="000000"/>
+        </w:rPr>
+        <w:t>FRF</w:t>
+      </w:r>
+      <w:r>
+        <w:rPr>
+          <w:rFonts w:ascii="Times New Roman" w:hAnsi="Times New Roman" w:cs="Times New Roman"/>
+          <w:b/>
+          <w:color w:val="000000"/>
+          <w:lang w:val="ru-RU"/>
+        </w:rPr>
+        <w:t xml:space="preserve"> АЧХ</w:t>
+      </w:r>
+      <w:r>
+        <w:rPr>
+          <w:rFonts w:ascii="Times New Roman" w:hAnsi="Times New Roman" w:cs="Times New Roman"/>
+          <w:color w:val="000000"/>
+          <w:lang w:val="ru-RU"/>
+        </w:rPr>
+        <w:t xml:space="preserve"> показывает коэффициент динамичности между заданными опорами и откликами. Этот режим доступен только для временных данных; у сохранённого спектра он отключён.</w:t>
+      </w:r>
+    </w:p>
+    <w:p>
+      <w:pPr>
+        <w:pStyle w:val="21"/>
+        <w:rPr>
+          <w:rFonts w:ascii="Times New Roman" w:hAnsi="Times New Roman" w:cs="Times New Roman"/>
+          <w:lang w:val="ru-RU"/>
+        </w:rPr>
+      </w:pPr>
+      <w:r>
+        <w:rPr>
+          <w:rFonts w:ascii="Times New Roman" w:hAnsi="Times New Roman" w:cs="Times New Roman"/>
+          <w:lang w:val="ru-RU"/>
+        </w:rPr>
+        <w:t>4.3 Масштаб и перемещение</w:t>
+      </w:r>
+    </w:p>
+    <w:p>
+      <w:pPr>
+        <w:rPr>
+          <w:rFonts w:ascii="Times New Roman" w:hAnsi="Times New Roman" w:cs="Times New Roman"/>
+          <w:lang w:val="ru-RU"/>
+        </w:rPr>
+      </w:pPr>
+      <w:r>
+        <w:rPr>
+          <w:rFonts w:ascii="Times New Roman" w:hAnsi="Times New Roman" w:cs="Times New Roman"/>
+          <w:color w:val="000000"/>
+          <w:lang w:val="ru-RU"/>
+        </w:rPr>
+        <w:t>Колесо мыши изменяет масштаб графика в</w:t>
+      </w:r>
+      <w:r>
+        <w:rPr>
+          <w:rFonts w:ascii="Times New Roman" w:hAnsi="Times New Roman" w:cs="Times New Roman"/>
+          <w:color w:val="000000"/>
+          <w:lang w:val="ru-RU"/>
+        </w:rPr>
+        <w:t xml:space="preserve">округ позиции указателя. Перетаскивание мышью перемещает видимую область. Команды </w:t>
+      </w:r>
+      <w:r>
+        <w:rPr>
+          <w:rFonts w:ascii="Times New Roman" w:hAnsi="Times New Roman" w:cs="Times New Roman"/>
+          <w:b/>
+          <w:color w:val="000000"/>
+          <w:lang w:val="ru-RU"/>
+        </w:rPr>
+        <w:t>Увеличить</w:t>
+      </w:r>
+      <w:r>
+        <w:rPr>
+          <w:rFonts w:ascii="Times New Roman" w:hAnsi="Times New Roman" w:cs="Times New Roman"/>
+          <w:color w:val="000000"/>
+          <w:lang w:val="ru-RU"/>
+        </w:rPr>
         <w:t xml:space="preserve">, </w:t>
       </w:r>
       <w:r>
         <w:rPr>
           <w:rFonts w:ascii="Times New Roman" w:hAnsi="Times New Roman" w:cs="Times New Roman"/>
-          <w:color w:val="000000"/>
-        </w:rPr>
-        <w:t>FFT</w:t>
+          <w:b/>
+          <w:color w:val="000000"/>
+          <w:lang w:val="ru-RU"/>
+        </w:rPr>
+        <w:t>Уменьшить</w:t>
+      </w:r>
+      <w:r>
+        <w:rPr>
+          <w:rFonts w:ascii="Times New Roman" w:hAnsi="Times New Roman" w:cs="Times New Roman"/>
+          <w:color w:val="000000"/>
+          <w:lang w:val="ru-RU"/>
+        </w:rPr>
+        <w:t xml:space="preserve">, </w:t>
+      </w:r>
+      <w:r>
+        <w:rPr>
+          <w:rFonts w:ascii="Times New Roman" w:hAnsi="Times New Roman" w:cs="Times New Roman"/>
+          <w:b/>
+          <w:color w:val="000000"/>
+          <w:lang w:val="ru-RU"/>
+        </w:rPr>
+        <w:t>Сбросить вид</w:t>
+      </w:r>
+      <w:r>
+        <w:rPr>
+          <w:rFonts w:ascii="Times New Roman" w:hAnsi="Times New Roman" w:cs="Times New Roman"/>
+          <w:color w:val="000000"/>
+          <w:lang w:val="ru-RU"/>
+        </w:rPr>
+        <w:t xml:space="preserve">, </w:t>
+      </w:r>
+      <w:r>
+        <w:rPr>
+          <w:rFonts w:ascii="Times New Roman" w:hAnsi="Times New Roman" w:cs="Times New Roman"/>
+          <w:b/>
+          <w:color w:val="000000"/>
+          <w:lang w:val="ru-RU"/>
+        </w:rPr>
+        <w:t>В начало</w:t>
       </w:r>
       <w:r>
         <w:rPr>
@@ -2499,6 +2789,73 @@
       <w:r>
         <w:rPr>
           <w:rFonts w:ascii="Times New Roman" w:hAnsi="Times New Roman" w:cs="Times New Roman"/>
+          <w:b/>
+          <w:color w:val="000000"/>
+          <w:lang w:val="ru-RU"/>
+        </w:rPr>
+        <w:t>В конец</w:t>
+      </w:r>
+      <w:r>
+        <w:rPr>
+          <w:rFonts w:ascii="Times New Roman" w:hAnsi="Times New Roman" w:cs="Times New Roman"/>
+          <w:color w:val="000000"/>
+          <w:lang w:val="ru-RU"/>
+        </w:rPr>
+        <w:t xml:space="preserve"> находятся в меню </w:t>
+      </w:r>
+      <w:r>
+        <w:rPr>
+          <w:rFonts w:ascii="Times New Roman" w:hAnsi="Times New Roman" w:cs="Times New Roman"/>
+          <w:b/>
+          <w:color w:val="000000"/>
+          <w:lang w:val="ru-RU"/>
+        </w:rPr>
+        <w:t>Вид</w:t>
+      </w:r>
+      <w:r>
+        <w:rPr>
+          <w:rFonts w:ascii="Times New Roman" w:hAnsi="Times New Roman" w:cs="Times New Roman"/>
+          <w:color w:val="000000"/>
+          <w:lang w:val="ru-RU"/>
+        </w:rPr>
+        <w:t xml:space="preserve"> и имеют назначаемые горячие клавиши.</w:t>
+      </w:r>
+    </w:p>
+    <w:p>
+      <w:pPr>
+        <w:rPr>
+          <w:rFonts w:ascii="Times New Roman" w:hAnsi="Times New Roman" w:cs="Times New Roman"/>
+          <w:lang w:val="ru-RU"/>
+        </w:rPr>
+      </w:pPr>
+      <w:r>
+        <w:rPr>
+          <w:rFonts w:ascii="Times New Roman" w:hAnsi="Times New Roman" w:cs="Times New Roman"/>
+          <w:b/>
+          <w:color w:val="000000"/>
+          <w:lang w:val="ru-RU"/>
+        </w:rPr>
+        <w:t>Автомасштабирование</w:t>
+      </w:r>
+      <w:r>
+        <w:rPr>
+          <w:rFonts w:ascii="Times New Roman" w:hAnsi="Times New Roman" w:cs="Times New Roman"/>
+          <w:color w:val="000000"/>
+          <w:lang w:val="ru-RU"/>
+        </w:rPr>
+        <w:t xml:space="preserve"> возвращает автоматический вертикальный ма</w:t>
+      </w:r>
+      <w:r>
+        <w:rPr>
+          <w:rFonts w:ascii="Times New Roman" w:hAnsi="Times New Roman" w:cs="Times New Roman"/>
+          <w:color w:val="000000"/>
+          <w:lang w:val="ru-RU"/>
+        </w:rPr>
+        <w:t xml:space="preserve">сштаб. В режиме </w:t>
+      </w:r>
+      <w:r>
+        <w:rPr>
+          <w:rFonts w:ascii="Times New Roman" w:hAnsi="Times New Roman" w:cs="Times New Roman"/>
           <w:color w:val="000000"/>
         </w:rPr>
         <w:t>FRF</w:t>
@@ -2509,109 +2866,7 @@
           <w:color w:val="000000"/>
           <w:lang w:val="ru-RU"/>
         </w:rPr>
-        <w:t>, а также инструменты курсора, точек</w:t>
-      </w:r>
-      <w:r>
-        <w:rPr>
-          <w:rFonts w:ascii="Times New Roman" w:hAnsi="Times New Roman" w:cs="Times New Roman"/>
-          <w:color w:val="000000"/>
-          <w:lang w:val="ru-RU"/>
-        </w:rPr>
-        <w:t>, маркеров и линий.</w:t>
-      </w:r>
-    </w:p>
-    <w:p>
-      <w:pPr>
-        <w:pStyle w:val="a"/>
-        <w:rPr>
-          <w:rFonts w:ascii="Times New Roman" w:hAnsi="Times New Roman" w:cs="Times New Roman"/>
-          <w:lang w:val="ru-RU"/>
-        </w:rPr>
-      </w:pPr>
-      <w:r>
-        <w:rPr>
-          <w:rFonts w:ascii="Times New Roman" w:hAnsi="Times New Roman" w:cs="Times New Roman"/>
-          <w:color w:val="000000"/>
-          <w:lang w:val="ru-RU"/>
-        </w:rPr>
-        <w:t>**Область графика.** В ней отображаются кривые, сетка, оси, легенда, разрывы и измерительные объекты.</w:t>
-      </w:r>
-    </w:p>
-    <w:p>
-      <w:pPr>
-        <w:pStyle w:val="a"/>
-        <w:rPr>
-          <w:rFonts w:ascii="Times New Roman" w:hAnsi="Times New Roman" w:cs="Times New Roman"/>
-        </w:rPr>
-      </w:pPr>
-      <w:r>
-        <w:rPr>
-          <w:rFonts w:ascii="Times New Roman" w:hAnsi="Times New Roman" w:cs="Times New Roman"/>
-          <w:color w:val="000000"/>
-          <w:lang w:val="ru-RU"/>
-        </w:rPr>
-        <w:t xml:space="preserve">**Правая панель.** В режимах </w:t>
-      </w:r>
-      <w:r>
-        <w:rPr>
-          <w:rFonts w:ascii="Times New Roman" w:hAnsi="Times New Roman" w:cs="Times New Roman"/>
-          <w:color w:val="000000"/>
-        </w:rPr>
-        <w:t>Time</w:t>
-      </w:r>
-      <w:r>
-        <w:rPr>
-          <w:rFonts w:ascii="Times New Roman" w:hAnsi="Times New Roman" w:cs="Times New Roman"/>
-          <w:color w:val="000000"/>
-          <w:lang w:val="ru-RU"/>
-        </w:rPr>
-        <w:t xml:space="preserve"> и </w:t>
-      </w:r>
-      <w:r>
-        <w:rPr>
-          <w:rFonts w:ascii="Times New Roman" w:hAnsi="Times New Roman" w:cs="Times New Roman"/>
-          <w:color w:val="000000"/>
-        </w:rPr>
-        <w:t>FFT</w:t>
-      </w:r>
-      <w:r>
-        <w:rPr>
-          <w:rFonts w:ascii="Times New Roman" w:hAnsi="Times New Roman" w:cs="Times New Roman"/>
-          <w:color w:val="000000"/>
-          <w:lang w:val="ru-RU"/>
-        </w:rPr>
-        <w:t xml:space="preserve"> она даёт доступ к каналам, точкам и обработке. </w:t>
-      </w:r>
-      <w:r>
-        <w:rPr>
-          <w:rFonts w:ascii="Times New Roman" w:hAnsi="Times New Roman" w:cs="Times New Roman"/>
-          <w:color w:val="000000"/>
-        </w:rPr>
-        <w:t xml:space="preserve">В FRF здесь выбираются роли каналов и </w:t>
-      </w:r>
-      <w:r>
-        <w:rPr>
-          <w:rFonts w:ascii="Times New Roman" w:hAnsi="Times New Roman" w:cs="Times New Roman"/>
-          <w:color w:val="000000"/>
-        </w:rPr>
-        <w:t>параметры расчёта.</w:t>
-      </w:r>
-    </w:p>
-    <w:p>
-      <w:pPr>
-        <w:pStyle w:val="a"/>
-        <w:rPr>
-          <w:rFonts w:ascii="Times New Roman" w:hAnsi="Times New Roman" w:cs="Times New Roman"/>
-          <w:lang w:val="ru-RU"/>
-        </w:rPr>
-      </w:pPr>
-      <w:r>
-        <w:rPr>
-          <w:rFonts w:ascii="Times New Roman" w:hAnsi="Times New Roman" w:cs="Times New Roman"/>
-          <w:color w:val="000000"/>
-          <w:lang w:val="ru-RU"/>
-        </w:rPr>
-        <w:t>**Строка состояния.** Показывает текущий режим, существенные параметры и предупреждения. Наведите указатель на строку состояния, чтобы увидеть полный текст, если окно узкое.</w:t>
+        <w:t xml:space="preserve"> автомасштаб КД всегда начинается с нуля; для графика средней опоры используется отдельный вертикальный масштаб.</w:t>
       </w:r>
     </w:p>
     <w:p>
@@ -2627,319 +2882,6 @@
           <w:rFonts w:ascii="Times New Roman" w:hAnsi="Times New Roman" w:cs="Times New Roman"/>
           <w:lang w:val="ru-RU"/>
         </w:rPr>
-        <w:t>4.2 Переключение режимов</w:t>
-      </w:r>
-    </w:p>
-    <w:p>
-      <w:pPr>
-        <w:rPr>
-          <w:rFonts w:ascii="Times New Roman" w:hAnsi="Times New Roman" w:cs="Times New Roman"/>
-          <w:lang w:val="ru-RU"/>
-        </w:rPr>
-      </w:pPr>
-      <w:r>
-        <w:rPr>
-          <w:rFonts w:ascii="Times New Roman" w:hAnsi="Times New Roman" w:cs="Times New Roman"/>
-          <w:b/>
-          <w:color w:val="000000"/>
-          <w:lang w:val="ru-RU"/>
-        </w:rPr>
-        <w:t>Время</w:t>
-      </w:r>
-      <w:r>
-        <w:rPr>
-          <w:rFonts w:ascii="Times New Roman" w:hAnsi="Times New Roman" w:cs="Times New Roman"/>
-          <w:color w:val="000000"/>
-          <w:lang w:val="ru-RU"/>
-        </w:rPr>
-        <w:t xml:space="preserve"> показывает исходные или обработа</w:t>
-      </w:r>
-      <w:r>
-        <w:rPr>
-          <w:rFonts w:ascii="Times New Roman" w:hAnsi="Times New Roman" w:cs="Times New Roman"/>
-          <w:color w:val="000000"/>
-          <w:lang w:val="ru-RU"/>
-        </w:rPr>
-        <w:t>нные сигналы как зависимость амплитуды от времени. Этот режим предназначен для проверки записи и выбора участка.</w:t>
-      </w:r>
-    </w:p>
-    <w:p>
-      <w:pPr>
-        <w:rPr>
-          <w:rFonts w:ascii="Times New Roman" w:hAnsi="Times New Roman" w:cs="Times New Roman"/>
-          <w:lang w:val="ru-RU"/>
-        </w:rPr>
-      </w:pPr>
-      <w:r>
-        <w:rPr>
-          <w:rFonts w:ascii="Times New Roman" w:hAnsi="Times New Roman" w:cs="Times New Roman"/>
-          <w:b/>
-          <w:color w:val="000000"/>
-          <w:lang w:val="ru-RU"/>
-        </w:rPr>
-        <w:t xml:space="preserve">Гц </w:t>
-      </w:r>
-      <w:r>
-        <w:rPr>
-          <w:rFonts w:ascii="Times New Roman" w:hAnsi="Times New Roman" w:cs="Times New Roman"/>
-          <w:b/>
-          <w:color w:val="000000"/>
-        </w:rPr>
-        <w:t>FFT</w:t>
-      </w:r>
-      <w:r>
-        <w:rPr>
-          <w:rFonts w:ascii="Times New Roman" w:hAnsi="Times New Roman" w:cs="Times New Roman"/>
-          <w:color w:val="000000"/>
-          <w:lang w:val="ru-RU"/>
-        </w:rPr>
-        <w:t xml:space="preserve"> показывает односторонний амплитудный спектр выбранных каналов. При новом участке, новой обработке или новом видимом канале спектр должен</w:t>
-      </w:r>
-      <w:r>
-        <w:rPr>
-          <w:rFonts w:ascii="Times New Roman" w:hAnsi="Times New Roman" w:cs="Times New Roman"/>
-          <w:color w:val="000000"/>
-          <w:lang w:val="ru-RU"/>
-        </w:rPr>
-        <w:t xml:space="preserve"> быть подготовлен заново.</w:t>
-      </w:r>
-    </w:p>
-    <w:p>
-      <w:pPr>
-        <w:rPr>
-          <w:rFonts w:ascii="Times New Roman" w:hAnsi="Times New Roman" w:cs="Times New Roman"/>
-          <w:lang w:val="ru-RU"/>
-        </w:rPr>
-      </w:pPr>
-      <w:r>
-        <w:rPr>
-          <w:rFonts w:ascii="Times New Roman" w:hAnsi="Times New Roman" w:cs="Times New Roman"/>
-          <w:b/>
-          <w:color w:val="000000"/>
-        </w:rPr>
-        <w:t>FRF</w:t>
-      </w:r>
-      <w:r>
-        <w:rPr>
-          <w:rFonts w:ascii="Times New Roman" w:hAnsi="Times New Roman" w:cs="Times New Roman"/>
-          <w:b/>
-          <w:color w:val="000000"/>
-          <w:lang w:val="ru-RU"/>
-        </w:rPr>
-        <w:t xml:space="preserve"> АЧХ</w:t>
-      </w:r>
-      <w:r>
-        <w:rPr>
-          <w:rFonts w:ascii="Times New Roman" w:hAnsi="Times New Roman" w:cs="Times New Roman"/>
-          <w:color w:val="000000"/>
-          <w:lang w:val="ru-RU"/>
-        </w:rPr>
-        <w:t xml:space="preserve"> показывает коэффициент динамичности между заданными опорами и откликами. Этот режим доступен только для временных данных; у сохранённого спектра он отключён.</w:t>
-      </w:r>
-    </w:p>
-    <w:p>
-      <w:pPr>
-        <w:pStyle w:val="21"/>
-        <w:rPr>
-          <w:rFonts w:ascii="Times New Roman" w:hAnsi="Times New Roman" w:cs="Times New Roman"/>
-          <w:lang w:val="ru-RU"/>
-        </w:rPr>
-      </w:pPr>
-      <w:r>
-        <w:rPr>
-          <w:rFonts w:ascii="Times New Roman" w:hAnsi="Times New Roman" w:cs="Times New Roman"/>
-          <w:lang w:val="ru-RU"/>
-        </w:rPr>
-        <w:t>4.3 Масштаб и перемещение</w:t>
-      </w:r>
-    </w:p>
-    <w:p>
-      <w:pPr>
-        <w:rPr>
-          <w:rFonts w:ascii="Times New Roman" w:hAnsi="Times New Roman" w:cs="Times New Roman"/>
-          <w:lang w:val="ru-RU"/>
-        </w:rPr>
-      </w:pPr>
-      <w:r>
-        <w:rPr>
-          <w:rFonts w:ascii="Times New Roman" w:hAnsi="Times New Roman" w:cs="Times New Roman"/>
-          <w:color w:val="000000"/>
-          <w:lang w:val="ru-RU"/>
-        </w:rPr>
-        <w:t>Колесо мыши изменяет масштаб графика в</w:t>
-      </w:r>
-      <w:r>
-        <w:rPr>
-          <w:rFonts w:ascii="Times New Roman" w:hAnsi="Times New Roman" w:cs="Times New Roman"/>
-          <w:color w:val="000000"/>
-          <w:lang w:val="ru-RU"/>
-        </w:rPr>
-        <w:t xml:space="preserve">округ позиции указателя. Перетаскивание мышью перемещает видимую область. Команды </w:t>
-      </w:r>
-      <w:r>
-        <w:rPr>
-          <w:rFonts w:ascii="Times New Roman" w:hAnsi="Times New Roman" w:cs="Times New Roman"/>
-          <w:b/>
-          <w:color w:val="000000"/>
-          <w:lang w:val="ru-RU"/>
-        </w:rPr>
-        <w:t>Увеличить</w:t>
-      </w:r>
-      <w:r>
-        <w:rPr>
-          <w:rFonts w:ascii="Times New Roman" w:hAnsi="Times New Roman" w:cs="Times New Roman"/>
-          <w:color w:val="000000"/>
-          <w:lang w:val="ru-RU"/>
-        </w:rPr>
-        <w:t xml:space="preserve">, </w:t>
-      </w:r>
-      <w:r>
-        <w:rPr>
-          <w:rFonts w:ascii="Times New Roman" w:hAnsi="Times New Roman" w:cs="Times New Roman"/>
-          <w:b/>
-          <w:color w:val="000000"/>
-          <w:lang w:val="ru-RU"/>
-        </w:rPr>
-        <w:t>Уменьшить</w:t>
-      </w:r>
-      <w:r>
-        <w:rPr>
-          <w:rFonts w:ascii="Times New Roman" w:hAnsi="Times New Roman" w:cs="Times New Roman"/>
-          <w:color w:val="000000"/>
-          <w:lang w:val="ru-RU"/>
-        </w:rPr>
-        <w:t xml:space="preserve">, </w:t>
-      </w:r>
-      <w:r>
-        <w:rPr>
-          <w:rFonts w:ascii="Times New Roman" w:hAnsi="Times New Roman" w:cs="Times New Roman"/>
-          <w:b/>
-          <w:color w:val="000000"/>
-          <w:lang w:val="ru-RU"/>
-        </w:rPr>
-        <w:t>Сбросить вид</w:t>
-      </w:r>
-      <w:r>
-        <w:rPr>
-          <w:rFonts w:ascii="Times New Roman" w:hAnsi="Times New Roman" w:cs="Times New Roman"/>
-          <w:color w:val="000000"/>
-          <w:lang w:val="ru-RU"/>
-        </w:rPr>
-        <w:t xml:space="preserve">, </w:t>
-      </w:r>
-      <w:r>
-        <w:rPr>
-          <w:rFonts w:ascii="Times New Roman" w:hAnsi="Times New Roman" w:cs="Times New Roman"/>
-          <w:b/>
-          <w:color w:val="000000"/>
-          <w:lang w:val="ru-RU"/>
-        </w:rPr>
-        <w:t>В начало</w:t>
-      </w:r>
-      <w:r>
-        <w:rPr>
-          <w:rFonts w:ascii="Times New Roman" w:hAnsi="Times New Roman" w:cs="Times New Roman"/>
-          <w:color w:val="000000"/>
-          <w:lang w:val="ru-RU"/>
-        </w:rPr>
-        <w:t xml:space="preserve"> и </w:t>
-      </w:r>
-      <w:r>
-        <w:rPr>
-          <w:rFonts w:ascii="Times New Roman" w:hAnsi="Times New Roman" w:cs="Times New Roman"/>
-          <w:b/>
-          <w:color w:val="000000"/>
-          <w:lang w:val="ru-RU"/>
-        </w:rPr>
-        <w:t>В конец</w:t>
-      </w:r>
-      <w:r>
-        <w:rPr>
-          <w:rFonts w:ascii="Times New Roman" w:hAnsi="Times New Roman" w:cs="Times New Roman"/>
-          <w:color w:val="000000"/>
-          <w:lang w:val="ru-RU"/>
-        </w:rPr>
-        <w:t xml:space="preserve"> находятся в меню </w:t>
-      </w:r>
-      <w:r>
-        <w:rPr>
-          <w:rFonts w:ascii="Times New Roman" w:hAnsi="Times New Roman" w:cs="Times New Roman"/>
-          <w:b/>
-          <w:color w:val="000000"/>
-          <w:lang w:val="ru-RU"/>
-        </w:rPr>
-        <w:t>Вид</w:t>
-      </w:r>
-      <w:r>
-        <w:rPr>
-          <w:rFonts w:ascii="Times New Roman" w:hAnsi="Times New Roman" w:cs="Times New Roman"/>
-          <w:color w:val="000000"/>
-          <w:lang w:val="ru-RU"/>
-        </w:rPr>
-        <w:t xml:space="preserve"> и имеют назначаемые горячие клавиши.</w:t>
-      </w:r>
-    </w:p>
-    <w:p>
-      <w:pPr>
-        <w:rPr>
-          <w:rFonts w:ascii="Times New Roman" w:hAnsi="Times New Roman" w:cs="Times New Roman"/>
-          <w:lang w:val="ru-RU"/>
-        </w:rPr>
-      </w:pPr>
-      <w:r>
-        <w:rPr>
-          <w:rFonts w:ascii="Times New Roman" w:hAnsi="Times New Roman" w:cs="Times New Roman"/>
-          <w:b/>
-          <w:color w:val="000000"/>
-          <w:lang w:val="ru-RU"/>
-        </w:rPr>
-        <w:t>Автомасштабирование</w:t>
-      </w:r>
-      <w:r>
-        <w:rPr>
-          <w:rFonts w:ascii="Times New Roman" w:hAnsi="Times New Roman" w:cs="Times New Roman"/>
-          <w:color w:val="000000"/>
-          <w:lang w:val="ru-RU"/>
-        </w:rPr>
-        <w:t xml:space="preserve"> возвращает автоматический вертикальный ма</w:t>
-      </w:r>
-      <w:r>
-        <w:rPr>
-          <w:rFonts w:ascii="Times New Roman" w:hAnsi="Times New Roman" w:cs="Times New Roman"/>
-          <w:color w:val="000000"/>
-          <w:lang w:val="ru-RU"/>
-        </w:rPr>
-        <w:t xml:space="preserve">сштаб. В режиме </w:t>
-      </w:r>
-      <w:r>
-        <w:rPr>
-          <w:rFonts w:ascii="Times New Roman" w:hAnsi="Times New Roman" w:cs="Times New Roman"/>
-          <w:color w:val="000000"/>
-        </w:rPr>
-        <w:t>FRF</w:t>
-      </w:r>
-      <w:r>
-        <w:rPr>
-          <w:rFonts w:ascii="Times New Roman" w:hAnsi="Times New Roman" w:cs="Times New Roman"/>
-          <w:color w:val="000000"/>
-          <w:lang w:val="ru-RU"/>
-        </w:rPr>
-        <w:t xml:space="preserve"> автомасштаб КД всегда начинается с нуля; для графика средней опоры используется отдельный вертикальный масштаб.</w:t>
-      </w:r>
-    </w:p>
-    <w:p>
-      <w:pPr>
-        <w:pStyle w:val="21"/>
-        <w:rPr>
-          <w:rFonts w:ascii="Times New Roman" w:hAnsi="Times New Roman" w:cs="Times New Roman"/>
-          <w:lang w:val="ru-RU"/>
-        </w:rPr>
-      </w:pPr>
-      <w:r>
-        <w:rPr>
-          <w:rFonts w:ascii="Times New Roman" w:hAnsi="Times New Roman" w:cs="Times New Roman"/>
-          <w:lang w:val="ru-RU"/>
-        </w:rPr>
         <w:t>4.4 Базовые инструменты</w:t>
       </w:r>
     </w:p>
@@ -2951,175 +2893,18 @@
         </w:rPr>
       </w:pPr>
       <w:r>
-        <w:rPr>
-          <w:rFonts w:ascii="Times New Roman" w:hAnsi="Times New Roman" w:cs="Times New Roman"/>
-          <w:color w:val="000000"/>
-          <w:lang w:val="ru-RU"/>
-        </w:rPr>
-        <w:t xml:space="preserve">Команда </w:t>
-      </w:r>
-      <w:r>
-        <w:rPr>
-          <w:rFonts w:ascii="Times New Roman" w:hAnsi="Times New Roman" w:cs="Times New Roman"/>
-          <w:b/>
-          <w:color w:val="000000"/>
-          <w:lang w:val="ru-RU"/>
-        </w:rPr>
-        <w:t>Курсор</w:t>
-      </w:r>
-      <w:r>
-        <w:rPr>
-          <w:rFonts w:ascii="Times New Roman" w:hAnsi="Times New Roman" w:cs="Times New Roman"/>
-          <w:color w:val="000000"/>
-          <w:lang w:val="ru-RU"/>
-        </w:rPr>
-        <w:t xml:space="preserve"> отключает активный режим добавления объектов. </w:t>
-      </w:r>
-      <w:r>
-        <w:rPr>
-          <w:rFonts w:ascii="Times New Roman" w:hAnsi="Times New Roman" w:cs="Times New Roman"/>
-          <w:b/>
-          <w:color w:val="000000"/>
-          <w:lang w:val="ru-RU"/>
-        </w:rPr>
-        <w:t>Точки</w:t>
-      </w:r>
-      <w:r>
-        <w:rPr>
-          <w:rFonts w:ascii="Times New Roman" w:hAnsi="Times New Roman" w:cs="Times New Roman"/>
-          <w:color w:val="000000"/>
-          <w:lang w:val="ru-RU"/>
-        </w:rPr>
-        <w:t xml:space="preserve"> добавляют измерительные точки, </w:t>
-      </w:r>
-      <w:r>
-        <w:rPr>
-          <w:rFonts w:ascii="Times New Roman" w:hAnsi="Times New Roman" w:cs="Times New Roman"/>
-          <w:b/>
-          <w:color w:val="000000"/>
-          <w:lang w:val="ru-RU"/>
-        </w:rPr>
-        <w:t>Ма</w:t>
-      </w:r>
-      <w:r>
-        <w:rPr>
-          <w:rFonts w:ascii="Times New Roman" w:hAnsi="Times New Roman" w:cs="Times New Roman"/>
-          <w:b/>
-          <w:color w:val="000000"/>
-          <w:lang w:val="ru-RU"/>
-        </w:rPr>
-        <w:t>ркер</w:t>
-      </w:r>
-      <w:r>
-        <w:rPr>
-          <w:rFonts w:ascii="Times New Roman" w:hAnsi="Times New Roman" w:cs="Times New Roman"/>
-          <w:color w:val="000000"/>
-          <w:lang w:val="ru-RU"/>
-        </w:rPr>
-        <w:t xml:space="preserve"> — маркер, а меню </w:t>
-      </w:r>
-      <w:r>
-        <w:rPr>
-          <w:rFonts w:ascii="Times New Roman" w:hAnsi="Times New Roman" w:cs="Times New Roman"/>
-          <w:b/>
-          <w:color w:val="000000"/>
-          <w:lang w:val="ru-RU"/>
-        </w:rPr>
-        <w:t>Линия</w:t>
-      </w:r>
-      <w:r>
-        <w:rPr>
-          <w:rFonts w:ascii="Times New Roman" w:hAnsi="Times New Roman" w:cs="Times New Roman"/>
-          <w:color w:val="000000"/>
-          <w:lang w:val="ru-RU"/>
-        </w:rPr>
-        <w:t xml:space="preserve"> позволяет выбрать вертикальную или горизонтальную направляющую. Маркер и выбранный тип линии остаются активными после постановки; нажмите </w:t>
-      </w:r>
-      <w:r>
-        <w:rPr>
-          <w:rFonts w:ascii="Times New Roman" w:hAnsi="Times New Roman" w:cs="Times New Roman"/>
-          <w:b/>
-          <w:color w:val="000000"/>
-          <w:lang w:val="ru-RU"/>
-        </w:rPr>
-        <w:t>Курсор</w:t>
-      </w:r>
-      <w:r>
-        <w:rPr>
-          <w:rFonts w:ascii="Times New Roman" w:hAnsi="Times New Roman" w:cs="Times New Roman"/>
-          <w:color w:val="000000"/>
-          <w:lang w:val="ru-RU"/>
-        </w:rPr>
-        <w:t xml:space="preserve"> или </w:t>
-      </w:r>
-      <w:r>
-        <w:rPr>
-          <w:rFonts w:ascii="Times New Roman" w:hAnsi="Times New Roman" w:cs="Times New Roman"/>
-          <w:color w:val="000000"/>
-        </w:rPr>
-        <w:t>Esc</w:t>
-      </w:r>
-      <w:r>
-        <w:rPr>
-          <w:rFonts w:ascii="Times New Roman" w:hAnsi="Times New Roman" w:cs="Times New Roman"/>
-          <w:color w:val="000000"/>
-          <w:lang w:val="ru-RU"/>
-        </w:rPr>
-        <w:t>, чтобы завершить добавление.</w:t>
-      </w:r>
-    </w:p>
-    <w:p>
-      <w:pPr>
-        <w:rPr>
-          <w:rFonts w:ascii="Times New Roman" w:hAnsi="Times New Roman" w:cs="Times New Roman"/>
-          <w:lang w:val="ru-RU"/>
-        </w:rPr>
-      </w:pPr>
-      <w:r>
-        <w:rPr>
-          <w:rFonts w:ascii="Times New Roman" w:hAnsi="Times New Roman" w:cs="Times New Roman"/>
-          <w:color w:val="000000"/>
-          <w:lang w:val="ru-RU"/>
-        </w:rPr>
-        <w:t xml:space="preserve">Включённый </w:t>
-      </w:r>
-      <w:r>
-        <w:rPr>
-          <w:rFonts w:ascii="Times New Roman" w:hAnsi="Times New Roman" w:cs="Times New Roman"/>
-          <w:color w:val="000000"/>
-        </w:rPr>
-        <w:t>Snap</w:t>
-      </w:r>
-      <w:r>
-        <w:rPr>
-          <w:rFonts w:ascii="Times New Roman" w:hAnsi="Times New Roman" w:cs="Times New Roman"/>
-          <w:color w:val="000000"/>
-          <w:lang w:val="ru-RU"/>
-        </w:rPr>
-        <w:t xml:space="preserve"> притягивает объект к данным. Д</w:t>
-      </w:r>
-      <w:r>
-        <w:rPr>
-          <w:rFonts w:ascii="Times New Roman" w:hAnsi="Times New Roman" w:cs="Times New Roman"/>
-          <w:color w:val="000000"/>
-          <w:lang w:val="ru-RU"/>
-        </w:rPr>
-        <w:t xml:space="preserve">ля </w:t>
-      </w:r>
-      <w:r>
-        <w:rPr>
-          <w:rFonts w:ascii="Times New Roman" w:hAnsi="Times New Roman" w:cs="Times New Roman"/>
-          <w:color w:val="000000"/>
-        </w:rPr>
-        <w:t>FRF</w:t>
-      </w:r>
-      <w:r>
-        <w:rPr>
-          <w:rFonts w:ascii="Times New Roman" w:hAnsi="Times New Roman" w:cs="Times New Roman"/>
-          <w:color w:val="000000"/>
-          <w:lang w:val="ru-RU"/>
-        </w:rPr>
-        <w:t xml:space="preserve"> измерительная точка выбирает ближайший отображённый бин КД с учётом сглаживания, поэтому точка остаётся на показанной кривой.</w:t>
+        <w:t>Команда Курсор отключает активный режим добавления объектов. Точки добавляют измерительные точки, Маркер — маркер, а меню Линия позволяет выбрать вертикальную или горизонтальную направляющую. Маркер и выбранный тип линии остаются активными после постановки; нажмите Курсор или Esc, чтобы завершить добавление. Если щёлкнуть по уже созданной точке, маркеру или линии, программа начинает перенос этого объекта, а не создаёт новый — даже при активном инструменте добавления.</w:t>
+      </w:r>
+    </w:p>
+    <w:p>
+      <w:pPr>
+        <w:rPr>
+          <w:rFonts w:ascii="Times New Roman" w:hAnsi="Times New Roman" w:cs="Times New Roman"/>
+          <w:lang w:val="ru-RU"/>
+        </w:rPr>
+      </w:pPr>
+      <w:r>
+        <w:t>Включённый Snap притягивает объект к данным и сохраняется при переносе. Для FRF измерительная точка верхнего графика выбирает ближайший отображённый бин КД с учётом сглаживания, поэтому точка остаётся на показанной кривой. Точка нижнего графика средней опоры привязывается к допустимому бину опоры и использует его физическую амплитуду. Кнопка блокировки запрещает добавление, перенос и очистку разметки активного документа, но не мешает навигации графика.</w:t>
       </w:r>
     </w:p>
     <w:p>
@@ -3647,33 +3432,7 @@
         </w:rPr>
       </w:pPr>
       <w:r>
-        <w:rPr>
-          <w:rFonts w:ascii="Times New Roman" w:hAnsi="Times New Roman" w:cs="Times New Roman"/>
-          <w:color w:val="000000"/>
-        </w:rPr>
-        <w:t xml:space="preserve">Включите режим </w:t>
-      </w:r>
-      <w:r>
-        <w:rPr>
-          <w:rFonts w:ascii="Times New Roman" w:hAnsi="Times New Roman" w:cs="Times New Roman"/>
-          <w:b/>
-          <w:color w:val="000000"/>
-        </w:rPr>
-        <w:t>Точки</w:t>
-      </w:r>
-      <w:r>
-        <w:rPr>
-          <w:rFonts w:ascii="Times New Roman" w:hAnsi="Times New Roman" w:cs="Times New Roman"/>
-          <w:color w:val="000000"/>
-        </w:rPr>
-        <w:t xml:space="preserve"> и щёлкните в области графика, чтобы добавить измерительную точку. Точки объединяются в группы; у группы есть имя, цвет и собственная видимость. Это позволяет, например,</w:t>
-      </w:r>
-      <w:r>
-        <w:rPr>
-          <w:rFonts w:ascii="Times New Roman" w:hAnsi="Times New Roman" w:cs="Times New Roman"/>
-          <w:color w:val="000000"/>
-        </w:rPr>
-        <w:t xml:space="preserve"> сравнивать точки одного опыта с точками другого события, не смешивая их на графике.</w:t>
+        <w:t>Включите режим Точки и щёлкните в области графика, чтобы добавить измерительную точку. Точки объединяются в группы; у группы есть имя, цвет и собственная видимость. Это позволяет, например, сравнивать точки одного опыта с точками другого события, не смешивая их на графике. В АЧХ точки верхнего графика КД и нижнего графика средней опоры хранятся в разных группах, потому что используют разные Y-шкалы.</w:t>
       </w:r>
     </w:p>
     <w:p>
@@ -3718,18 +3477,7 @@
         </w:rPr>
       </w:pPr>
       <w:r>
-        <w:rPr>
-          <w:rFonts w:ascii="Times New Roman" w:hAnsi="Times New Roman" w:cs="Times New Roman"/>
-          <w:color w:val="000000"/>
-        </w:rPr>
-        <w:t>Snap привязывает точку, маркер или вертикальную линию к данным. В Time и FFT это помогает не получить координату между фактическими отсчётами или</w:t>
-      </w:r>
-      <w:r>
-        <w:rPr>
-          <w:rFonts w:ascii="Times New Roman" w:hAnsi="Times New Roman" w:cs="Times New Roman"/>
-          <w:color w:val="000000"/>
-        </w:rPr>
-        <w:t xml:space="preserve"> спектральными бинами. В FRF точка выбирает ближайший отображаемый бин КД; при включённом сглаживании используется уже сглаженное для отрисовки значение.</w:t>
+        <w:t>Snap привязывает точку, маркер или вертикальную линию к данным. В Time и FFT это помогает не получить координату между фактическими отсчётами или спектральными бинами. В FRF точка верхнего графика выбирает ближайший отображаемый бин КД; при включённом сглаживании используется уже сглаженное для отрисовки значение. Точка графика средней опоры выбирает ближайший допустимый бин её амплитуды. Эти правила действуют и при переносе существующего объекта.</w:t>
       </w:r>
     </w:p>
     <w:p>
@@ -3795,78 +3543,7 @@
         </w:rPr>
       </w:pPr>
       <w:r>
-        <w:rPr>
-          <w:rFonts w:ascii="Times New Roman" w:hAnsi="Times New Roman" w:cs="Times New Roman"/>
-          <w:color w:val="000000"/>
-        </w:rPr>
-        <w:t xml:space="preserve">После выбора </w:t>
-      </w:r>
-      <w:r>
-        <w:rPr>
-          <w:rFonts w:ascii="Times New Roman" w:hAnsi="Times New Roman" w:cs="Times New Roman"/>
-          <w:b/>
-          <w:color w:val="000000"/>
-        </w:rPr>
-        <w:t>Маркер</w:t>
-      </w:r>
-      <w:r>
-        <w:rPr>
-          <w:rFonts w:ascii="Times New Roman" w:hAnsi="Times New Roman" w:cs="Times New Roman"/>
-          <w:color w:val="000000"/>
-        </w:rPr>
-        <w:t xml:space="preserve"> или о</w:t>
-      </w:r>
-      <w:r>
-        <w:rPr>
-          <w:rFonts w:ascii="Times New Roman" w:hAnsi="Times New Roman" w:cs="Times New Roman"/>
-          <w:color w:val="000000"/>
-        </w:rPr>
-        <w:t xml:space="preserve">дного из типов в меню </w:t>
-      </w:r>
-      <w:r>
-        <w:rPr>
-          <w:rFonts w:ascii="Times New Roman" w:hAnsi="Times New Roman" w:cs="Times New Roman"/>
-          <w:b/>
-          <w:color w:val="000000"/>
-        </w:rPr>
-        <w:t>Линия</w:t>
-      </w:r>
-      <w:r>
-        <w:rPr>
-          <w:rFonts w:ascii="Times New Roman" w:hAnsi="Times New Roman" w:cs="Times New Roman"/>
-          <w:color w:val="000000"/>
-        </w:rPr>
-        <w:t xml:space="preserve"> инструмент остаётся активным. Это удобно для серии отметок. Для возврата к обычной навигации нажмите </w:t>
-      </w:r>
-      <w:r>
-        <w:rPr>
-          <w:rFonts w:ascii="Times New Roman" w:hAnsi="Times New Roman" w:cs="Times New Roman"/>
-          <w:b/>
-          <w:color w:val="000000"/>
-        </w:rPr>
-        <w:t>Курсор</w:t>
-      </w:r>
-      <w:r>
-        <w:rPr>
-          <w:rFonts w:ascii="Times New Roman" w:hAnsi="Times New Roman" w:cs="Times New Roman"/>
-          <w:color w:val="000000"/>
-        </w:rPr>
-        <w:t xml:space="preserve"> или Esc. В меню </w:t>
-      </w:r>
-      <w:r>
-        <w:rPr>
-          <w:rFonts w:ascii="Times New Roman" w:hAnsi="Times New Roman" w:cs="Times New Roman"/>
-          <w:b/>
-          <w:color w:val="000000"/>
-        </w:rPr>
-        <w:t>Инструменты</w:t>
-      </w:r>
-      <w:r>
-        <w:rPr>
-          <w:rFonts w:ascii="Times New Roman" w:hAnsi="Times New Roman" w:cs="Times New Roman"/>
-          <w:color w:val="000000"/>
-        </w:rPr>
-        <w:t xml:space="preserve"> можно очистить точки, маркеры или линии текущего режима.</w:t>
+        <w:t>После выбора Маркер или одного из типов в меню Линия инструмент остаётся активным. Это удобно для серии отметок. Для возврата к обычной навигации нажмите Курсор или Esc. Чтобы перенести существующий объект, потяните его мышью; Snap, если включён, применится к новому положению. При включённой блокировке очистка недоступна.</w:t>
       </w:r>
     </w:p>
     <w:p>
@@ -3891,55 +3568,7 @@
         </w:rPr>
       </w:pPr>
       <w:r>
-        <w:rPr>
-          <w:rFonts w:ascii="Times New Roman" w:hAnsi="Times New Roman" w:cs="Times New Roman"/>
-          <w:color w:val="000000"/>
-        </w:rPr>
-        <w:t>Добавление и о</w:t>
-      </w:r>
-      <w:r>
-        <w:rPr>
-          <w:rFonts w:ascii="Times New Roman" w:hAnsi="Times New Roman" w:cs="Times New Roman"/>
-          <w:color w:val="000000"/>
-        </w:rPr>
-        <w:t xml:space="preserve">чистка точек, маркеров и линий, а также изменения представления, которые поддерживает история, отменяются через </w:t>
-      </w:r>
-      <w:r>
-        <w:rPr>
-          <w:rFonts w:ascii="Times New Roman" w:hAnsi="Times New Roman" w:cs="Times New Roman"/>
-          <w:b/>
-          <w:color w:val="000000"/>
-        </w:rPr>
-        <w:t>Отменить</w:t>
-      </w:r>
-      <w:r>
-        <w:rPr>
-          <w:rFonts w:ascii="Times New Roman" w:hAnsi="Times New Roman" w:cs="Times New Roman"/>
-          <w:color w:val="000000"/>
-        </w:rPr>
-        <w:t xml:space="preserve"> и возвращаются через </w:t>
-      </w:r>
-      <w:r>
-        <w:rPr>
-          <w:rFonts w:ascii="Times New Roman" w:hAnsi="Times New Roman" w:cs="Times New Roman"/>
-          <w:b/>
-          <w:color w:val="000000"/>
-        </w:rPr>
-        <w:t>Повторить</w:t>
-      </w:r>
-      <w:r>
-        <w:rPr>
-          <w:rFonts w:ascii="Times New Roman" w:hAnsi="Times New Roman" w:cs="Times New Roman"/>
-          <w:color w:val="000000"/>
-        </w:rPr>
-        <w:t>. Сохранённый проект удерживает восстановимые измерительные объекты; для передачи численных результатов в</w:t>
-      </w:r>
-      <w:r>
-        <w:rPr>
-          <w:rFonts w:ascii="Times New Roman" w:hAnsi="Times New Roman" w:cs="Times New Roman"/>
-          <w:color w:val="000000"/>
-        </w:rPr>
-        <w:t xml:space="preserve"> другой инструмент используйте экспорт CSV.</w:t>
+        <w:t>Добавление, перенос и очистка точек, маркеров и линий, а также изменения представления, которые поддерживает история, отменяются через Отменить и возвращаются через Повторить. Один перенос считается одним действием истории. Сохранённый проект удерживает восстановимые измерительные объекты; для передачи численных результатов в другой инструмент используйте экспорт CSV.</w:t>
       </w:r>
     </w:p>
     <w:p>

</xml_diff>